<commit_message>
Remove IXL from the syllabus and the Fluency Lab planning documents
Co-Authored-By: Claude Opus 5.5 <noreply@anthropic.com>
Claude-Session: https://claude.ai/code/session_017eFFy6o8pxhxis4ePhh22P
</commit_message>
<xml_diff>
--- a/grade8/Fluency-Lab-Package/teacher-planning/FluencyLab_Proposal.docx
+++ b/grade8/Fluency-Lab-Package/teacher-planning/FluencyLab_Proposal.docx
@@ -162,7 +162,7 @@
           <w:sz w:val="22"/>
           <w:szCs w:val="22"/>
         </w:rPr>
-        <w:t xml:space="preserve">, our own IXL diagnostic data shows that the median eighth grader in this cohort is being asked to reason about linear functions while still lacking automaticity with grade 2–5 arithmetic. </w:t>
+        <w:t xml:space="preserve">, our own diagnostic data shows that the median eighth grader in this cohort is being asked to reason about linear functions while still lacking automaticity with grade 2–5 arithmetic. </w:t>
       </w:r>
       <w:r>
         <w:rPr>
@@ -228,7 +228,7 @@
           <w:sz w:val="22"/>
           <w:szCs w:val="22"/>
         </w:rPr>
-        <w:t xml:space="preserve">The IXL LevelUp diagnostic was administered to </w:t>
+        <w:t xml:space="preserve">The diagnostic was administered to </w:t>
       </w:r>
       <w:r>
         <w:rPr>
@@ -256,7 +256,7 @@
           <w:sz w:val="22"/>
           <w:szCs w:val="22"/>
         </w:rPr>
-        <w:t xml:space="preserve">grade level of the skills IXL itself recommends as each student's next step</w:t>
+        <w:t>grade level of the skills the diagnostic itself recommends as each student's next step</w:t>
       </w:r>
       <w:r>
         <w:rPr>
@@ -844,7 +844,7 @@
           <w:sz w:val="22"/>
           <w:szCs w:val="22"/>
         </w:rPr>
-        <w:t xml:space="preserve">Read that bottom row again. Across sixty-one students, IXL identified </w:t>
+        <w:t xml:space="preserve">Read that bottom row again. Across sixty-one students, the diagnostic identified </w:t>
       </w:r>
       <w:r>
         <w:rPr>
@@ -2454,7 +2454,7 @@
           <w:sz w:val="22"/>
           <w:szCs w:val="22"/>
         </w:rPr>
-        <w:t xml:space="preserve">Each short assessment follows a fixed spiral ratio so new skills are introduced while prior skills stay warm: roughly half the items target the current focus skill, a quarter the immediately preceding skill, and a quarter cumulative review. Skill selection is anchored to the IXL diagnostic, so every student is practicing at the edge of their own competence rather than a single class-wide target.</w:t>
+        <w:t>Each short assessment follows a fixed spiral ratio so new skills are introduced while prior skills stay warm: roughly half the items target the current focus skill, a quarter the immediately preceding skill, and a quarter cumulative review. Skill selection is anchored to the diagnostic, so every student is practicing at the edge of their own competence rather than a single class-wide target.</w:t>
       </w:r>
     </w:p>
     <w:p>
@@ -2672,7 +2672,7 @@
           <w:sz w:val="22"/>
           <w:szCs w:val="22"/>
         </w:rPr>
-        <w:t xml:space="preserve">IXL SmartScore, streaks, personal-best tracking, and a growth-oriented mastery dashboard make improvement legible; visible progress is among the most powerful motivators available.</w:t>
+        <w:t>Streaks, personal-best tracking, and a growth-oriented mastery dashboard make improvement legible; visible progress is among the most powerful motivators available.</w:t>
       </w:r>
     </w:p>
     <w:p>

</xml_diff>